<commit_message>
about to get new hg engine
</commit_message>
<xml_diff>
--- a/!work docs/Changes to be made.docx
+++ b/!work docs/Changes to be made.docx
@@ -95,15 +95,7 @@
     </w:p>
     <w:p>
       <w:r>
-        <w:t xml:space="preserve">fluffy or some </w:t>
-      </w:r>
-      <w:proofErr w:type="gramStart"/>
-      <w:r>
-        <w:t>anger based</w:t>
-      </w:r>
-      <w:proofErr w:type="gramEnd"/>
-      <w:r>
-        <w:t xml:space="preserve"> ability </w:t>
+        <w:t xml:space="preserve">fluffy or some anger based ability </w:t>
       </w:r>
       <w:proofErr w:type="spellStart"/>
       <w:r>
@@ -757,21 +749,7 @@
         <w:rPr>
           <w:strike/>
         </w:rPr>
-        <w:t xml:space="preserve">Slow Start </w:t>
-      </w:r>
-      <w:proofErr w:type="gramStart"/>
-      <w:r>
-        <w:rPr>
-          <w:strike/>
-        </w:rPr>
-        <w:t>reduce</w:t>
-      </w:r>
-      <w:proofErr w:type="gramEnd"/>
-      <w:r>
-        <w:rPr>
-          <w:strike/>
-        </w:rPr>
-        <w:t xml:space="preserve"> turns to 4, reduce damage %</w:t>
+        <w:t>Slow Start reduce turns to 4, reduce damage %</w:t>
       </w:r>
     </w:p>
     <w:p>
@@ -989,7 +967,24 @@
         <w:t>Kinesis – 2x vs steel</w:t>
       </w:r>
     </w:p>
-    <w:p/>
+    <w:p>
+      <w:proofErr w:type="spellStart"/>
+      <w:r>
+        <w:t>Raichu</w:t>
+      </w:r>
+      <w:proofErr w:type="spellEnd"/>
+      <w:r>
+        <w:t xml:space="preserve"> – wave cra</w:t>
+      </w:r>
+      <w:r>
+        <w:t>sh</w:t>
+      </w:r>
+    </w:p>
+    <w:p>
+      <w:r>
+        <w:t>Pikachu - surf</w:t>
+      </w:r>
+    </w:p>
     <w:p/>
     <w:p>
       <w:r>

</xml_diff>